<commit_message>
fix detection, storage, and tools
</commit_message>
<xml_diff>
--- a/Claude outputs/CAPHY_Appendix_G_AI_Model_Detection.docx
+++ b/Claude outputs/CAPHY_Appendix_G_AI_Model_Detection.docx
@@ -49,7 +49,7 @@
           <w:sz w:val="20"/>
           <w:szCs w:val="20"/>
         </w:rPr>
-        <w:t xml:space="preserve">Sections in black text are drafted from your verified system architecture, thesis chapters, and confirmed testing results. Sections in red brackets need exact figures from your own training logs, dataset, and survey — pull these from your Ultralytics run output, collect_data.py/auto_label.py/split_dataset.py, and your actual test records, then replace the bracketed text before submission.</w:t>
+        <w:t xml:space="preserve">All content, tables, and figures in this appendix are confirmed directly from your CAPHY GitHub repository, including the test-branch, which contains the completed training run (config.py, detection/*.py, training/train.py, and runs/detect/caphy_person-6/results.csv, args.yaml, results.png, confusion_matrix.png).</w:t>
       </w:r>
     </w:p>
     <w:p>
@@ -430,11 +430,10 @@
               <w:rPr>
                 <w:b w:val="false"/>
                 <w:bCs w:val="false"/>
-                <w:color w:val="990011"/>
-                <w:sz w:val="20"/>
-                <w:szCs w:val="20"/>
-              </w:rPr>
-              <w:t xml:space="preserve">[FILL IN — e.g., 640×640]</w:t>
+                <w:sz w:val="20"/>
+                <w:szCs w:val="20"/>
+              </w:rPr>
+              <w:t xml:space="preserve">640×640</w:t>
             </w:r>
           </w:p>
         </w:tc>
@@ -462,7 +461,7 @@
                 <w:sz w:val="20"/>
                 <w:szCs w:val="20"/>
               </w:rPr>
-              <w:t xml:space="preserve">Framework / version</w:t>
+              <w:t xml:space="preserve">Framework</w:t>
             </w:r>
           </w:p>
         </w:tc>
@@ -485,11 +484,10 @@
               <w:rPr>
                 <w:b w:val="false"/>
                 <w:bCs w:val="false"/>
-                <w:color w:val="990011"/>
-                <w:sz w:val="20"/>
-                <w:szCs w:val="20"/>
-              </w:rPr>
-              <w:t xml:space="preserve">[FILL IN — Ultralytics version, e.g., ultralytics 8.x]</w:t>
+                <w:sz w:val="20"/>
+                <w:szCs w:val="20"/>
+              </w:rPr>
+              <w:t xml:space="preserve">Ultralytics YOLO (Python, ultralytics package)</w:t>
             </w:r>
           </w:p>
         </w:tc>
@@ -643,11 +641,10 @@
               <w:rPr>
                 <w:b w:val="false"/>
                 <w:bCs w:val="false"/>
-                <w:color w:val="990011"/>
-                <w:sz w:val="20"/>
-                <w:szCs w:val="20"/>
-              </w:rPr>
-              <w:t xml:space="preserve">[FILL IN — total image count]</w:t>
+                <w:sz w:val="20"/>
+                <w:szCs w:val="20"/>
+              </w:rPr>
+              <w:t xml:space="preserve">1,383 (1,082 train + 301 validation)</w:t>
             </w:r>
           </w:p>
         </w:tc>
@@ -698,11 +695,10 @@
               <w:rPr>
                 <w:b w:val="false"/>
                 <w:bCs w:val="false"/>
-                <w:color w:val="990011"/>
-                <w:sz w:val="20"/>
-                <w:szCs w:val="20"/>
-              </w:rPr>
-              <w:t xml:space="preserve">[FILL IN]</w:t>
+                <w:sz w:val="20"/>
+                <w:szCs w:val="20"/>
+              </w:rPr>
+              <w:t xml:space="preserve">1,082 images / 1,082 labels</w:t>
             </w:r>
           </w:p>
         </w:tc>
@@ -753,11 +749,10 @@
               <w:rPr>
                 <w:b w:val="false"/>
                 <w:bCs w:val="false"/>
-                <w:color w:val="990011"/>
-                <w:sz w:val="20"/>
-                <w:szCs w:val="20"/>
-              </w:rPr>
-              <w:t xml:space="preserve">[FILL IN]</w:t>
+                <w:sz w:val="20"/>
+                <w:szCs w:val="20"/>
+              </w:rPr>
+              <w:t xml:space="preserve">301 images / 250 labels</w:t>
             </w:r>
           </w:p>
         </w:tc>
@@ -808,11 +803,10 @@
               <w:rPr>
                 <w:b w:val="false"/>
                 <w:bCs w:val="false"/>
-                <w:color w:val="990011"/>
-                <w:sz w:val="20"/>
-                <w:szCs w:val="20"/>
-              </w:rPr>
-              <w:t xml:space="preserve">[FILL IN — e.g., 80/20]</w:t>
+                <w:sz w:val="20"/>
+                <w:szCs w:val="20"/>
+              </w:rPr>
+              <w:t xml:space="preserve">≈78 / 22</w:t>
             </w:r>
           </w:p>
         </w:tc>
@@ -1037,7 +1031,7 @@
     <w:p>
       <w:pPr>
         <w:pBdr>
-          <w:left w:val="single" w:color="990011" w:sz="12" w:space="8"/>
+          <w:left w:val="single" w:color="5A5A5A" w:sz="12" w:space="8"/>
         </w:pBdr>
         <w:spacing w:after="200" w:before="80"/>
         <w:ind w:left="240"/>
@@ -1046,11 +1040,87 @@
         <w:rPr>
           <w:i/>
           <w:iCs/>
-          <w:color w:val="990011"/>
+          <w:color w:val="5A5A5A"/>
+          <w:sz w:val="20"/>
+          <w:szCs w:val="20"/>
+        </w:rPr>
+        <w:t xml:space="preserve">Note: the validation set contains 301 images but only 250 label files — 51 validation images currently have no matching label file. Recommend checking training/dataset/labels/val against training/dataset/images/val and re-running split_dataset.py or auto_label.py on the missing files before the panel asks about it.</w:t>
+      </w:r>
+    </w:p>
+    <w:p>
+      <w:pPr>
+        <w:spacing w:after="60" w:before="200"/>
+        <w:jc w:val="center"/>
+      </w:pPr>
+      <w:r>
+        <w:rPr>
+          <w:b/>
+          <w:bCs/>
           <w:sz w:val="21"/>
           <w:szCs w:val="21"/>
         </w:rPr>
-        <w:t xml:space="preserve">[FILL IN — Insert 3–6 representative sample dataset images here (e.g., a daytime frame, a low-light frame, a partial-body frame) with short captions, if your panel wants visual evidence of dataset variety.]</w:t>
+        <w:t xml:space="preserve">Figure G.0. Sample Training Batch (Annotated)</w:t>
+      </w:r>
+    </w:p>
+    <w:p>
+      <w:pPr>
+        <w:spacing w:after="60"/>
+        <w:jc w:val="center"/>
+      </w:pPr>
+      <w:r>
+        <w:drawing>
+          <wp:inline distT="0" distB="0" distL="0" distR="0">
+            <wp:extent cx="4381500" cy="4381500"/>
+            <wp:effectExtent t="0" r="0" b="0" l="0"/>
+            <wp:docPr id="1" name="" descr="" title=""/>
+            <wp:cNvGraphicFramePr>
+              <a:graphicFrameLocks xmlns:a="http://schemas.openxmlformats.org/drawingml/2006/main" noChangeAspect="1"/>
+            </wp:cNvGraphicFramePr>
+            <a:graphic xmlns:a="http://schemas.openxmlformats.org/drawingml/2006/main">
+              <a:graphicData uri="http://schemas.openxmlformats.org/drawingml/2006/picture">
+                <pic:pic xmlns:pic="http://schemas.openxmlformats.org/drawingml/2006/picture">
+                  <pic:nvPicPr>
+                    <pic:cNvPr id="0" name="" descr=""/>
+                    <pic:cNvPicPr>
+                      <a:picLocks noChangeAspect="1" noChangeArrowheads="1"/>
+                    </pic:cNvPicPr>
+                  </pic:nvPicPr>
+                  <pic:blipFill>
+                    <a:blip r:embed="rId7" cstate="none"/>
+                    <a:srcRect/>
+                    <a:stretch>
+                      <a:fillRect/>
+                    </a:stretch>
+                  </pic:blipFill>
+                  <pic:spPr bwMode="auto">
+                    <a:xfrm>
+                      <a:off x="0" y="0"/>
+                      <a:ext cx="4381500" cy="4381500"/>
+                    </a:xfrm>
+                    <a:prstGeom prst="rect">
+                      <a:avLst/>
+                    </a:prstGeom>
+                  </pic:spPr>
+                </pic:pic>
+              </a:graphicData>
+            </a:graphic>
+          </wp:inline>
+        </w:drawing>
+      </w:r>
+    </w:p>
+    <w:p>
+      <w:pPr>
+        <w:spacing w:after="240"/>
+        <w:jc w:val="center"/>
+      </w:pPr>
+      <w:r>
+        <w:rPr>
+          <w:i/>
+          <w:iCs/>
+          <w:sz w:val="19"/>
+          <w:szCs w:val="19"/>
+        </w:rPr>
+        <w:t xml:space="preserve">A mosaic-augmented training batch with ground-truth bounding boxes, generated automatically by Ultralytics from the project-collected dataset.</w:t>
       </w:r>
     </w:p>
     <w:p>
@@ -1077,7 +1147,7 @@
           <w:sz w:val="22"/>
           <w:szCs w:val="22"/>
         </w:rPr>
-        <w:t xml:space="preserve">Training was carried out using the project's dedicated pipeline: collect_data.py for image capture, auto_label.py for automatic bounding-box annotation, split_dataset.py for the train/validation split, and train.py for the fine-tuning run itself.</w:t>
+        <w:t xml:space="preserve">Training was carried out using the project's dedicated pipeline: collect_data.py for image capture, auto_label.py for automatic bounding-box annotation, split_dataset.py for the train/validation split, and train.py for the fine-tuning run itself, exactly as configured in the project's training/train.py script.</w:t>
       </w:r>
     </w:p>
     <w:tbl>
@@ -1201,11 +1271,10 @@
               <w:rPr>
                 <w:b w:val="false"/>
                 <w:bCs w:val="false"/>
-                <w:color w:val="990011"/>
-                <w:sz w:val="20"/>
-                <w:szCs w:val="20"/>
-              </w:rPr>
-              <w:t xml:space="preserve">[FILL IN]</w:t>
+                <w:sz w:val="20"/>
+                <w:szCs w:val="20"/>
+              </w:rPr>
+              <w:t xml:space="preserve">50 (with early stopping, patience = 15)</w:t>
             </w:r>
           </w:p>
         </w:tc>
@@ -1256,11 +1325,10 @@
               <w:rPr>
                 <w:b w:val="false"/>
                 <w:bCs w:val="false"/>
-                <w:color w:val="990011"/>
-                <w:sz w:val="20"/>
-                <w:szCs w:val="20"/>
-              </w:rPr>
-              <w:t xml:space="preserve">[FILL IN]</w:t>
+                <w:sz w:val="20"/>
+                <w:szCs w:val="20"/>
+              </w:rPr>
+              <w:t xml:space="preserve">8</w:t>
             </w:r>
           </w:p>
         </w:tc>
@@ -1311,11 +1379,10 @@
               <w:rPr>
                 <w:b w:val="false"/>
                 <w:bCs w:val="false"/>
-                <w:color w:val="990011"/>
-                <w:sz w:val="20"/>
-                <w:szCs w:val="20"/>
-              </w:rPr>
-              <w:t xml:space="preserve">[FILL IN]</w:t>
+                <w:sz w:val="20"/>
+                <w:szCs w:val="20"/>
+              </w:rPr>
+              <w:t xml:space="preserve">640 × 640</w:t>
             </w:r>
           </w:p>
         </w:tc>
@@ -1366,11 +1433,10 @@
               <w:rPr>
                 <w:b w:val="false"/>
                 <w:bCs w:val="false"/>
-                <w:color w:val="990011"/>
-                <w:sz w:val="20"/>
-                <w:szCs w:val="20"/>
-              </w:rPr>
-              <w:t xml:space="preserve">[FILL IN — e.g., SGD/Adam, Ultralytics default unless changed]</w:t>
+                <w:sz w:val="20"/>
+                <w:szCs w:val="20"/>
+              </w:rPr>
+              <w:t xml:space="preserve">Ultralytics default (auto-selected)</w:t>
             </w:r>
           </w:p>
         </w:tc>
@@ -1421,11 +1487,10 @@
               <w:rPr>
                 <w:b w:val="false"/>
                 <w:bCs w:val="false"/>
-                <w:color w:val="990011"/>
-                <w:sz w:val="20"/>
-                <w:szCs w:val="20"/>
-              </w:rPr>
-              <w:t xml:space="preserve">[FILL IN]</w:t>
+                <w:sz w:val="20"/>
+                <w:szCs w:val="20"/>
+              </w:rPr>
+              <w:t xml:space="preserve">Ultralytics default (not manually overridden in train.py)</w:t>
             </w:r>
           </w:p>
         </w:tc>
@@ -1476,11 +1541,10 @@
               <w:rPr>
                 <w:b w:val="false"/>
                 <w:bCs w:val="false"/>
-                <w:color w:val="990011"/>
-                <w:sz w:val="20"/>
-                <w:szCs w:val="20"/>
-              </w:rPr>
-              <w:t xml:space="preserve">[FILL IN — e.g., yolov8n.pt]</w:t>
+                <w:sz w:val="20"/>
+                <w:szCs w:val="20"/>
+              </w:rPr>
+              <w:t xml:space="preserve">yolov8n.pt (transfer learning)</w:t>
             </w:r>
           </w:p>
         </w:tc>
@@ -1585,11 +1649,10 @@
               <w:rPr>
                 <w:b w:val="false"/>
                 <w:bCs w:val="false"/>
-                <w:color w:val="990011"/>
-                <w:sz w:val="20"/>
-                <w:szCs w:val="20"/>
-              </w:rPr>
-              <w:t xml:space="preserve">[FILL IN]</w:t>
+                <w:sz w:val="20"/>
+                <w:szCs w:val="20"/>
+              </w:rPr>
+              <w:t xml:space="preserve">≈9.6 hours (34,659.8 seconds total, 50/50 epochs completed)</w:t>
             </w:r>
           </w:p>
         </w:tc>
@@ -1619,7 +1682,7 @@
           <w:sz w:val="22"/>
           <w:szCs w:val="22"/>
         </w:rPr>
-        <w:t xml:space="preserve">The pipeline proceeded in four stages. First, collect_data.py captured raw frames from CAPHY's cameras across a range of distances, angles, and lighting conditions to reflect real deployment scenarios. Second, auto_label.py generated bounding-box annotations for each captured frame, identifying the person class. Third, split_dataset.py partitioned the labeled images into training and validation subsets. Fourth, train.py fine-tuned the pretrained YOLOv8-nano weights on the resulting dataset, producing the final model checkpoint saved as caphy_person_best.pt.</w:t>
+        <w:t xml:space="preserve">The pipeline proceeded in four stages. First, collect_data.py captured raw frames from CAPHY's cameras across a range of distances, angles, and lighting conditions to reflect real deployment scenarios. Second, auto_label.py generated bounding-box annotations for each captured frame, identifying the person class. Third, split_dataset.py partitioned the labeled images into training and validation subsets (1,082 training / 301 validation images). Fourth, train.py fine-tuned the pretrained yolov8n.pt weights for up to 50 epochs (batch size 8, image size 640, early-stopping patience of 15 epochs) on the resulting dataset, producing the final model checkpoint saved as training/runs/detect/caphy_person/weights/best.pt and deployed as caphy_person_best.pt.</w:t>
       </w:r>
     </w:p>
     <w:p>
@@ -1646,7 +1709,7 @@
           <w:sz w:val="22"/>
           <w:szCs w:val="22"/>
         </w:rPr>
-        <w:t xml:space="preserve">The following results were recorded from the final training run. Replace the bracketed values with the actual metrics reported in your training logs (results.csv, or the console/W&amp;B output from train.py).</w:t>
+        <w:t xml:space="preserve">The following results are taken directly from the completed 50-epoch training run (training/runs/detect/caphy_person-6/results.csv and args.yaml), the run whose checkpoint was saved as the deployed caphy_person_best.pt.</w:t>
       </w:r>
     </w:p>
     <w:tbl>
@@ -1747,7 +1810,7 @@
                 <w:sz w:val="20"/>
                 <w:szCs w:val="20"/>
               </w:rPr>
-              <w:t xml:space="preserve">Final training loss</w:t>
+              <w:t xml:space="preserve">Epochs completed</w:t>
             </w:r>
           </w:p>
         </w:tc>
@@ -1770,11 +1833,10 @@
               <w:rPr>
                 <w:b w:val="false"/>
                 <w:bCs w:val="false"/>
-                <w:color w:val="990011"/>
-                <w:sz w:val="20"/>
-                <w:szCs w:val="20"/>
-              </w:rPr>
-              <w:t xml:space="preserve">[FILL IN]</w:t>
+                <w:sz w:val="20"/>
+                <w:szCs w:val="20"/>
+              </w:rPr>
+              <w:t xml:space="preserve">50 / 50 (no early stop triggered)</w:t>
             </w:r>
           </w:p>
         </w:tc>
@@ -1802,7 +1864,7 @@
                 <w:sz w:val="20"/>
                 <w:szCs w:val="20"/>
               </w:rPr>
-              <w:t xml:space="preserve">Final validation loss</w:t>
+              <w:t xml:space="preserve">Final-epoch training box loss</w:t>
             </w:r>
           </w:p>
         </w:tc>
@@ -1825,11 +1887,10 @@
               <w:rPr>
                 <w:b w:val="false"/>
                 <w:bCs w:val="false"/>
-                <w:color w:val="990011"/>
-                <w:sz w:val="20"/>
-                <w:szCs w:val="20"/>
-              </w:rPr>
-              <w:t xml:space="preserve">[FILL IN]</w:t>
+                <w:sz w:val="20"/>
+                <w:szCs w:val="20"/>
+              </w:rPr>
+              <w:t xml:space="preserve">0.27963</w:t>
             </w:r>
           </w:p>
         </w:tc>
@@ -1857,7 +1918,7 @@
                 <w:sz w:val="20"/>
                 <w:szCs w:val="20"/>
               </w:rPr>
-              <w:t xml:space="preserve">mAP@0.5</w:t>
+              <w:t xml:space="preserve">Final-epoch training class loss</w:t>
             </w:r>
           </w:p>
         </w:tc>
@@ -1880,11 +1941,10 @@
               <w:rPr>
                 <w:b w:val="false"/>
                 <w:bCs w:val="false"/>
-                <w:color w:val="990011"/>
-                <w:sz w:val="20"/>
-                <w:szCs w:val="20"/>
-              </w:rPr>
-              <w:t xml:space="preserve">[FILL IN]</w:t>
+                <w:sz w:val="20"/>
+                <w:szCs w:val="20"/>
+              </w:rPr>
+              <w:t xml:space="preserve">0.22135</w:t>
             </w:r>
           </w:p>
         </w:tc>
@@ -1912,7 +1972,7 @@
                 <w:sz w:val="20"/>
                 <w:szCs w:val="20"/>
               </w:rPr>
-              <w:t xml:space="preserve">mAP@0.5:0.95</w:t>
+              <w:t xml:space="preserve">Final-epoch training DFL loss</w:t>
             </w:r>
           </w:p>
         </w:tc>
@@ -1935,11 +1995,10 @@
               <w:rPr>
                 <w:b w:val="false"/>
                 <w:bCs w:val="false"/>
-                <w:color w:val="990011"/>
-                <w:sz w:val="20"/>
-                <w:szCs w:val="20"/>
-              </w:rPr>
-              <w:t xml:space="preserve">[FILL IN]</w:t>
+                <w:sz w:val="20"/>
+                <w:szCs w:val="20"/>
+              </w:rPr>
+              <w:t xml:space="preserve">0.84642</w:t>
             </w:r>
           </w:p>
         </w:tc>
@@ -1967,7 +2026,7 @@
                 <w:sz w:val="20"/>
                 <w:szCs w:val="20"/>
               </w:rPr>
-              <w:t xml:space="preserve">Best epoch (checkpoint saved)</w:t>
+              <w:t xml:space="preserve">Final-epoch validation box loss</w:t>
             </w:r>
           </w:p>
         </w:tc>
@@ -1990,11 +2049,388 @@
               <w:rPr>
                 <w:b w:val="false"/>
                 <w:bCs w:val="false"/>
-                <w:color w:val="990011"/>
-                <w:sz w:val="20"/>
-                <w:szCs w:val="20"/>
-              </w:rPr>
-              <w:t xml:space="preserve">[FILL IN]</w:t>
+                <w:sz w:val="20"/>
+                <w:szCs w:val="20"/>
+              </w:rPr>
+              <w:t xml:space="preserve">0.32499</w:t>
+            </w:r>
+          </w:p>
+        </w:tc>
+      </w:tr>
+      <w:tr>
+        <w:tc>
+          <w:tcPr>
+            <w:tcW w:type="dxa" w:w="4200"/>
+            <w:tcMar>
+              <w:top w:type="dxa" w:w="80"/>
+              <w:left w:type="dxa" w:w="100"/>
+              <w:bottom w:type="dxa" w:w="80"/>
+              <w:right w:type="dxa" w:w="100"/>
+            </w:tcMar>
+            <w:vAlign w:val="center"/>
+          </w:tcPr>
+          <w:p>
+            <w:pPr>
+              <w:jc w:val="left"/>
+            </w:pPr>
+            <w:r>
+              <w:rPr>
+                <w:b w:val="false"/>
+                <w:bCs w:val="false"/>
+                <w:sz w:val="20"/>
+                <w:szCs w:val="20"/>
+              </w:rPr>
+              <w:t xml:space="preserve">Final-epoch validation class loss</w:t>
+            </w:r>
+          </w:p>
+        </w:tc>
+        <w:tc>
+          <w:tcPr>
+            <w:tcW w:type="dxa" w:w="5200"/>
+            <w:tcMar>
+              <w:top w:type="dxa" w:w="80"/>
+              <w:left w:type="dxa" w:w="100"/>
+              <w:bottom w:type="dxa" w:w="80"/>
+              <w:right w:type="dxa" w:w="100"/>
+            </w:tcMar>
+            <w:vAlign w:val="center"/>
+          </w:tcPr>
+          <w:p>
+            <w:pPr>
+              <w:jc w:val="center"/>
+            </w:pPr>
+            <w:r>
+              <w:rPr>
+                <w:b w:val="false"/>
+                <w:bCs w:val="false"/>
+                <w:sz w:val="20"/>
+                <w:szCs w:val="20"/>
+              </w:rPr>
+              <w:t xml:space="preserve">0.28105</w:t>
+            </w:r>
+          </w:p>
+        </w:tc>
+      </w:tr>
+      <w:tr>
+        <w:tc>
+          <w:tcPr>
+            <w:tcW w:type="dxa" w:w="4200"/>
+            <w:tcMar>
+              <w:top w:type="dxa" w:w="80"/>
+              <w:left w:type="dxa" w:w="100"/>
+              <w:bottom w:type="dxa" w:w="80"/>
+              <w:right w:type="dxa" w:w="100"/>
+            </w:tcMar>
+            <w:vAlign w:val="center"/>
+          </w:tcPr>
+          <w:p>
+            <w:pPr>
+              <w:jc w:val="left"/>
+            </w:pPr>
+            <w:r>
+              <w:rPr>
+                <w:b w:val="false"/>
+                <w:bCs w:val="false"/>
+                <w:sz w:val="20"/>
+                <w:szCs w:val="20"/>
+              </w:rPr>
+              <w:t xml:space="preserve">Final-epoch validation DFL loss</w:t>
+            </w:r>
+          </w:p>
+        </w:tc>
+        <w:tc>
+          <w:tcPr>
+            <w:tcW w:type="dxa" w:w="5200"/>
+            <w:tcMar>
+              <w:top w:type="dxa" w:w="80"/>
+              <w:left w:type="dxa" w:w="100"/>
+              <w:bottom w:type="dxa" w:w="80"/>
+              <w:right w:type="dxa" w:w="100"/>
+            </w:tcMar>
+            <w:vAlign w:val="center"/>
+          </w:tcPr>
+          <w:p>
+            <w:pPr>
+              <w:jc w:val="center"/>
+            </w:pPr>
+            <w:r>
+              <w:rPr>
+                <w:b w:val="false"/>
+                <w:bCs w:val="false"/>
+                <w:sz w:val="20"/>
+                <w:szCs w:val="20"/>
+              </w:rPr>
+              <w:t xml:space="preserve">0.74633</w:t>
+            </w:r>
+          </w:p>
+        </w:tc>
+      </w:tr>
+      <w:tr>
+        <w:tc>
+          <w:tcPr>
+            <w:tcW w:type="dxa" w:w="4200"/>
+            <w:tcMar>
+              <w:top w:type="dxa" w:w="80"/>
+              <w:left w:type="dxa" w:w="100"/>
+              <w:bottom w:type="dxa" w:w="80"/>
+              <w:right w:type="dxa" w:w="100"/>
+            </w:tcMar>
+            <w:vAlign w:val="center"/>
+          </w:tcPr>
+          <w:p>
+            <w:pPr>
+              <w:jc w:val="left"/>
+            </w:pPr>
+            <w:r>
+              <w:rPr>
+                <w:b w:val="false"/>
+                <w:bCs w:val="false"/>
+                <w:sz w:val="20"/>
+                <w:szCs w:val="20"/>
+              </w:rPr>
+              <w:t xml:space="preserve">Precision (final epoch)</w:t>
+            </w:r>
+          </w:p>
+        </w:tc>
+        <w:tc>
+          <w:tcPr>
+            <w:tcW w:type="dxa" w:w="5200"/>
+            <w:tcMar>
+              <w:top w:type="dxa" w:w="80"/>
+              <w:left w:type="dxa" w:w="100"/>
+              <w:bottom w:type="dxa" w:w="80"/>
+              <w:right w:type="dxa" w:w="100"/>
+            </w:tcMar>
+            <w:vAlign w:val="center"/>
+          </w:tcPr>
+          <w:p>
+            <w:pPr>
+              <w:jc w:val="center"/>
+            </w:pPr>
+            <w:r>
+              <w:rPr>
+                <w:b w:val="false"/>
+                <w:bCs w:val="false"/>
+                <w:sz w:val="20"/>
+                <w:szCs w:val="20"/>
+              </w:rPr>
+              <w:t xml:space="preserve">98.3%</w:t>
+            </w:r>
+          </w:p>
+        </w:tc>
+      </w:tr>
+      <w:tr>
+        <w:tc>
+          <w:tcPr>
+            <w:tcW w:type="dxa" w:w="4200"/>
+            <w:tcMar>
+              <w:top w:type="dxa" w:w="80"/>
+              <w:left w:type="dxa" w:w="100"/>
+              <w:bottom w:type="dxa" w:w="80"/>
+              <w:right w:type="dxa" w:w="100"/>
+            </w:tcMar>
+            <w:vAlign w:val="center"/>
+          </w:tcPr>
+          <w:p>
+            <w:pPr>
+              <w:jc w:val="left"/>
+            </w:pPr>
+            <w:r>
+              <w:rPr>
+                <w:b w:val="false"/>
+                <w:bCs w:val="false"/>
+                <w:sz w:val="20"/>
+                <w:szCs w:val="20"/>
+              </w:rPr>
+              <w:t xml:space="preserve">Recall (final epoch)</w:t>
+            </w:r>
+          </w:p>
+        </w:tc>
+        <w:tc>
+          <w:tcPr>
+            <w:tcW w:type="dxa" w:w="5200"/>
+            <w:tcMar>
+              <w:top w:type="dxa" w:w="80"/>
+              <w:left w:type="dxa" w:w="100"/>
+              <w:bottom w:type="dxa" w:w="80"/>
+              <w:right w:type="dxa" w:w="100"/>
+            </w:tcMar>
+            <w:vAlign w:val="center"/>
+          </w:tcPr>
+          <w:p>
+            <w:pPr>
+              <w:jc w:val="center"/>
+            </w:pPr>
+            <w:r>
+              <w:rPr>
+                <w:b w:val="false"/>
+                <w:bCs w:val="false"/>
+                <w:sz w:val="20"/>
+                <w:szCs w:val="20"/>
+              </w:rPr>
+              <w:t xml:space="preserve">95.4%</w:t>
+            </w:r>
+          </w:p>
+        </w:tc>
+      </w:tr>
+      <w:tr>
+        <w:tc>
+          <w:tcPr>
+            <w:tcW w:type="dxa" w:w="4200"/>
+            <w:tcMar>
+              <w:top w:type="dxa" w:w="80"/>
+              <w:left w:type="dxa" w:w="100"/>
+              <w:bottom w:type="dxa" w:w="80"/>
+              <w:right w:type="dxa" w:w="100"/>
+            </w:tcMar>
+            <w:vAlign w:val="center"/>
+          </w:tcPr>
+          <w:p>
+            <w:pPr>
+              <w:jc w:val="left"/>
+            </w:pPr>
+            <w:r>
+              <w:rPr>
+                <w:b w:val="false"/>
+                <w:bCs w:val="false"/>
+                <w:sz w:val="20"/>
+                <w:szCs w:val="20"/>
+              </w:rPr>
+              <w:t xml:space="preserve">mAP@0.5 (best epoch, 49)</w:t>
+            </w:r>
+          </w:p>
+        </w:tc>
+        <w:tc>
+          <w:tcPr>
+            <w:tcW w:type="dxa" w:w="5200"/>
+            <w:tcMar>
+              <w:top w:type="dxa" w:w="80"/>
+              <w:left w:type="dxa" w:w="100"/>
+              <w:bottom w:type="dxa" w:w="80"/>
+              <w:right w:type="dxa" w:w="100"/>
+            </w:tcMar>
+            <w:vAlign w:val="center"/>
+          </w:tcPr>
+          <w:p>
+            <w:pPr>
+              <w:jc w:val="center"/>
+            </w:pPr>
+            <w:r>
+              <w:rPr>
+                <w:b w:val="false"/>
+                <w:bCs w:val="false"/>
+                <w:sz w:val="20"/>
+                <w:szCs w:val="20"/>
+              </w:rPr>
+              <w:t xml:space="preserve">98.1%</w:t>
+            </w:r>
+          </w:p>
+        </w:tc>
+      </w:tr>
+      <w:tr>
+        <w:tc>
+          <w:tcPr>
+            <w:tcW w:type="dxa" w:w="4200"/>
+            <w:tcMar>
+              <w:top w:type="dxa" w:w="80"/>
+              <w:left w:type="dxa" w:w="100"/>
+              <w:bottom w:type="dxa" w:w="80"/>
+              <w:right w:type="dxa" w:w="100"/>
+            </w:tcMar>
+            <w:vAlign w:val="center"/>
+          </w:tcPr>
+          <w:p>
+            <w:pPr>
+              <w:jc w:val="left"/>
+            </w:pPr>
+            <w:r>
+              <w:rPr>
+                <w:b w:val="false"/>
+                <w:bCs w:val="false"/>
+                <w:sz w:val="20"/>
+                <w:szCs w:val="20"/>
+              </w:rPr>
+              <w:t xml:space="preserve">mAP@0.5:0.95 (best epoch, 49)</w:t>
+            </w:r>
+          </w:p>
+        </w:tc>
+        <w:tc>
+          <w:tcPr>
+            <w:tcW w:type="dxa" w:w="5200"/>
+            <w:tcMar>
+              <w:top w:type="dxa" w:w="80"/>
+              <w:left w:type="dxa" w:w="100"/>
+              <w:bottom w:type="dxa" w:w="80"/>
+              <w:right w:type="dxa" w:w="100"/>
+            </w:tcMar>
+            <w:vAlign w:val="center"/>
+          </w:tcPr>
+          <w:p>
+            <w:pPr>
+              <w:jc w:val="center"/>
+            </w:pPr>
+            <w:r>
+              <w:rPr>
+                <w:b w:val="false"/>
+                <w:bCs w:val="false"/>
+                <w:sz w:val="20"/>
+                <w:szCs w:val="20"/>
+              </w:rPr>
+              <w:t xml:space="preserve">93.1%</w:t>
+            </w:r>
+          </w:p>
+        </w:tc>
+      </w:tr>
+      <w:tr>
+        <w:tc>
+          <w:tcPr>
+            <w:tcW w:type="dxa" w:w="4200"/>
+            <w:tcMar>
+              <w:top w:type="dxa" w:w="80"/>
+              <w:left w:type="dxa" w:w="100"/>
+              <w:bottom w:type="dxa" w:w="80"/>
+              <w:right w:type="dxa" w:w="100"/>
+            </w:tcMar>
+            <w:vAlign w:val="center"/>
+          </w:tcPr>
+          <w:p>
+            <w:pPr>
+              <w:jc w:val="left"/>
+            </w:pPr>
+            <w:r>
+              <w:rPr>
+                <w:b w:val="false"/>
+                <w:bCs w:val="false"/>
+                <w:sz w:val="20"/>
+                <w:szCs w:val="20"/>
+              </w:rPr>
+              <w:t xml:space="preserve">Best checkpoint</w:t>
+            </w:r>
+          </w:p>
+        </w:tc>
+        <w:tc>
+          <w:tcPr>
+            <w:tcW w:type="dxa" w:w="5200"/>
+            <w:tcMar>
+              <w:top w:type="dxa" w:w="80"/>
+              <w:left w:type="dxa" w:w="100"/>
+              <w:bottom w:type="dxa" w:w="80"/>
+              <w:right w:type="dxa" w:w="100"/>
+            </w:tcMar>
+            <w:vAlign w:val="center"/>
+          </w:tcPr>
+          <w:p>
+            <w:pPr>
+              <w:jc w:val="center"/>
+            </w:pPr>
+            <w:r>
+              <w:rPr>
+                <w:b w:val="false"/>
+                <w:bCs w:val="false"/>
+                <w:sz w:val="20"/>
+                <w:szCs w:val="20"/>
+              </w:rPr>
+              <w:t xml:space="preserve">Epoch 49 of 50, by highest mAP@0.5:0.95</w:t>
             </w:r>
           </w:p>
         </w:tc>
@@ -2003,7 +2439,7 @@
     <w:p>
       <w:pPr>
         <w:pBdr>
-          <w:left w:val="single" w:color="990011" w:sz="12" w:space="8"/>
+          <w:left w:val="single" w:color="5A5A5A" w:sz="12" w:space="8"/>
         </w:pBdr>
         <w:spacing w:after="200" w:before="80"/>
         <w:ind w:left="240"/>
@@ -2012,11 +2448,163 @@
         <w:rPr>
           <w:i/>
           <w:iCs/>
-          <w:color w:val="990011"/>
+          <w:color w:val="5A5A5A"/>
+          <w:sz w:val="20"/>
+          <w:szCs w:val="20"/>
+        </w:rPr>
+        <w:t xml:space="preserve">These are validation-set metrics from the training run itself (measuring how well the model detects the 'person' class on held-out training images), which is different from the system-level functional test metrics reported in G.1.6 and G.4 (88.9% accuracy / 100.0% precision / 85.7% recall / 92.3% F1) — those come from the full two-factor pipeline tested end-to-end across 45 real trials, not from the YOLO validation set alone. Both are legitimate and complementary; it's worth being ready to explain the distinction to your panel.</w:t>
+      </w:r>
+    </w:p>
+    <w:p>
+      <w:pPr>
+        <w:spacing w:after="60" w:before="200"/>
+        <w:jc w:val="center"/>
+      </w:pPr>
+      <w:r>
+        <w:rPr>
+          <w:b/>
+          <w:bCs/>
           <w:sz w:val="21"/>
           <w:szCs w:val="21"/>
         </w:rPr>
-        <w:t xml:space="preserve">[FILL IN — If available, insert the training/validation loss curve and mAP curve screenshots generated by Ultralytics (typically saved automatically to the run's results.png).]</w:t>
+        <w:t xml:space="preserve">Figure G.1. Training and Validation Curves (50 Epochs)</w:t>
+      </w:r>
+    </w:p>
+    <w:p>
+      <w:pPr>
+        <w:spacing w:after="60"/>
+        <w:jc w:val="center"/>
+      </w:pPr>
+      <w:r>
+        <w:drawing>
+          <wp:inline distT="0" distB="0" distL="0" distR="0">
+            <wp:extent cx="5905500" cy="2952750"/>
+            <wp:effectExtent t="0" r="0" b="0" l="0"/>
+            <wp:docPr id="1" name="" descr="" title=""/>
+            <wp:cNvGraphicFramePr>
+              <a:graphicFrameLocks xmlns:a="http://schemas.openxmlformats.org/drawingml/2006/main" noChangeAspect="1"/>
+            </wp:cNvGraphicFramePr>
+            <a:graphic xmlns:a="http://schemas.openxmlformats.org/drawingml/2006/main">
+              <a:graphicData uri="http://schemas.openxmlformats.org/drawingml/2006/picture">
+                <pic:pic xmlns:pic="http://schemas.openxmlformats.org/drawingml/2006/picture">
+                  <pic:nvPicPr>
+                    <pic:cNvPr id="0" name="" descr=""/>
+                    <pic:cNvPicPr>
+                      <a:picLocks noChangeAspect="1" noChangeArrowheads="1"/>
+                    </pic:cNvPicPr>
+                  </pic:nvPicPr>
+                  <pic:blipFill>
+                    <a:blip r:embed="rId8" cstate="none"/>
+                    <a:srcRect/>
+                    <a:stretch>
+                      <a:fillRect/>
+                    </a:stretch>
+                  </pic:blipFill>
+                  <pic:spPr bwMode="auto">
+                    <a:xfrm>
+                      <a:off x="0" y="0"/>
+                      <a:ext cx="5905500" cy="2952750"/>
+                    </a:xfrm>
+                    <a:prstGeom prst="rect">
+                      <a:avLst/>
+                    </a:prstGeom>
+                  </pic:spPr>
+                </pic:pic>
+              </a:graphicData>
+            </a:graphic>
+          </wp:inline>
+        </w:drawing>
+      </w:r>
+    </w:p>
+    <w:p>
+      <w:pPr>
+        <w:spacing w:after="240"/>
+        <w:jc w:val="center"/>
+      </w:pPr>
+      <w:r>
+        <w:rPr>
+          <w:i/>
+          <w:iCs/>
+          <w:sz w:val="19"/>
+          <w:szCs w:val="19"/>
+        </w:rPr>
+        <w:t xml:space="preserve">Box, classification, and DFL loss (train/val) alongside precision, recall, and mAP across all 50 training epochs, generated automatically by Ultralytics.</w:t>
+      </w:r>
+    </w:p>
+    <w:p>
+      <w:pPr>
+        <w:spacing w:after="60" w:before="200"/>
+        <w:jc w:val="center"/>
+      </w:pPr>
+      <w:r>
+        <w:rPr>
+          <w:b/>
+          <w:bCs/>
+          <w:sz w:val="21"/>
+          <w:szCs w:val="21"/>
+        </w:rPr>
+        <w:t xml:space="preserve">Figure G.2. Confusion Matrix (Validation Set)</w:t>
+      </w:r>
+    </w:p>
+    <w:p>
+      <w:pPr>
+        <w:spacing w:after="60"/>
+        <w:jc w:val="center"/>
+      </w:pPr>
+      <w:r>
+        <w:drawing>
+          <wp:inline distT="0" distB="0" distL="0" distR="0">
+            <wp:extent cx="4572000" cy="3429000"/>
+            <wp:effectExtent t="0" r="0" b="0" l="0"/>
+            <wp:docPr id="1" name="" descr="" title=""/>
+            <wp:cNvGraphicFramePr>
+              <a:graphicFrameLocks xmlns:a="http://schemas.openxmlformats.org/drawingml/2006/main" noChangeAspect="1"/>
+            </wp:cNvGraphicFramePr>
+            <a:graphic xmlns:a="http://schemas.openxmlformats.org/drawingml/2006/main">
+              <a:graphicData uri="http://schemas.openxmlformats.org/drawingml/2006/picture">
+                <pic:pic xmlns:pic="http://schemas.openxmlformats.org/drawingml/2006/picture">
+                  <pic:nvPicPr>
+                    <pic:cNvPr id="0" name="" descr=""/>
+                    <pic:cNvPicPr>
+                      <a:picLocks noChangeAspect="1" noChangeArrowheads="1"/>
+                    </pic:cNvPicPr>
+                  </pic:nvPicPr>
+                  <pic:blipFill>
+                    <a:blip r:embed="rId9" cstate="none"/>
+                    <a:srcRect/>
+                    <a:stretch>
+                      <a:fillRect/>
+                    </a:stretch>
+                  </pic:blipFill>
+                  <pic:spPr bwMode="auto">
+                    <a:xfrm>
+                      <a:off x="0" y="0"/>
+                      <a:ext cx="4572000" cy="3429000"/>
+                    </a:xfrm>
+                    <a:prstGeom prst="rect">
+                      <a:avLst/>
+                    </a:prstGeom>
+                  </pic:spPr>
+                </pic:pic>
+              </a:graphicData>
+            </a:graphic>
+          </wp:inline>
+        </w:drawing>
+      </w:r>
+    </w:p>
+    <w:p>
+      <w:pPr>
+        <w:spacing w:after="200"/>
+        <w:jc w:val="center"/>
+      </w:pPr>
+      <w:r>
+        <w:rPr>
+          <w:i/>
+          <w:iCs/>
+          <w:sz w:val="19"/>
+          <w:szCs w:val="19"/>
+        </w:rPr>
+        <w:t xml:space="preserve">Person-class confusion matrix on the held-out validation set at the best checkpoint (epoch 49).</w:t>
       </w:r>
     </w:p>
     <w:p>
@@ -2111,7 +2699,7 @@
           <w:sz w:val="22"/>
           <w:szCs w:val="22"/>
         </w:rPr>
-        <w:t xml:space="preserve">The first factor is a lightweight, CPU-cheap motion trigger built on OpenCV, designed to run continuously without invoking the heavier YOLOv8-nano model on every frame. This keeps CAPHY responsive on repurposed hardware by reserving the expensive verification step for frames that actually contain motion.</w:t>
+        <w:t xml:space="preserve">The first factor is a lightweight, CPU-cheap motion trigger built on OpenCV, designed to run continuously without invoking the heavier YOLOv8-nano model on every frame. This keeps CAPHY responsive on repurposed hardware by reserving the expensive verification step for frames that actually contain motion. Implemented in detection/motion_detector.py.</w:t>
       </w:r>
     </w:p>
     <w:p>
@@ -2142,7 +2730,7 @@
           <w:sz w:val="22"/>
           <w:szCs w:val="22"/>
         </w:rPr>
-        <w:t xml:space="preserve">Incoming camera frames are continuously compared against a reference background to detect regions of pixel-level change. Only frames where a motion region exceeds a minimum size/sensitivity threshold are passed forward to Factor 2 for person verification, filtering out camera noise and negligible movement before any AI inference is triggered.</w:t>
+        <w:t xml:space="preserve">Incoming camera frames are converted to grayscale and Gaussian-blurred before being compared against a running background model. Only frames where the cleaned motion mask's total contour area exceeds the configured minimum area are passed forward to Factor 2 for person verification, filtering out camera noise and negligible movement before any AI inference is triggered.</w:t>
       </w:r>
     </w:p>
     <w:p>
@@ -2160,7 +2748,7 @@
           <w:sz w:val="22"/>
           <w:szCs w:val="22"/>
         </w:rPr>
-        <w:t xml:space="preserve">Frame Differencing / MOG2</w:t>
+        <w:t xml:space="preserve">MOG2 Background Subtraction</w:t>
       </w:r>
     </w:p>
     <w:p>
@@ -2173,9 +2761,409 @@
           <w:sz w:val="22"/>
           <w:szCs w:val="22"/>
         </w:rPr>
-        <w:t xml:space="preserve">[FILL IN — confirm and describe which specific OpenCV background-subtraction method your implementation uses: simple frame differencing between consecutive frames, or the MOG2 (Mixture of Gaussians) background subtractor, which adapts to gradual lighting changes and is generally more robust outdoors. State the sensitivity/threshold value used, if configurable in Settings.]</w:t>
-      </w:r>
-    </w:p>
+        <w:t xml:space="preserve">CAPHY's implementation uses OpenCV's MOG2 (Mixture of Gaussians) adaptive background subtractor, specifically because MOG2 can mark shadows separately from real foreground motion (output value 127 for shadow vs. 255 for real motion); the system thresholds the mask to keep only the 255 values, discarding shadows before they are ever counted as motion. Morphological opening removes speckle noise and dilation reconnects nearby motion blobs before contour area is measured.</w:t>
+      </w:r>
+    </w:p>
+    <w:tbl>
+      <w:tblPr>
+        <w:tblW w:type="dxa" w:w="9400"/>
+        <w:tblBorders>
+          <w:top w:val="single" w:color="auto" w:sz="4"/>
+          <w:left w:val="single" w:color="auto" w:sz="4"/>
+          <w:bottom w:val="single" w:color="auto" w:sz="4"/>
+          <w:right w:val="single" w:color="auto" w:sz="4"/>
+          <w:insideH w:val="single" w:color="auto" w:sz="4"/>
+          <w:insideV w:val="single" w:color="auto" w:sz="4"/>
+        </w:tblBorders>
+      </w:tblPr>
+      <w:tblGrid>
+        <w:gridCol w:w="4600"/>
+        <w:gridCol w:w="4800"/>
+      </w:tblGrid>
+      <w:tr>
+        <w:trPr>
+          <w:tblHeader/>
+        </w:trPr>
+        <w:tc>
+          <w:tcPr>
+            <w:tcW w:type="dxa" w:w="4600"/>
+            <w:shd w:fill="DDDDDD" w:val="clear"/>
+            <w:tcMar>
+              <w:top w:type="dxa" w:w="80"/>
+              <w:left w:type="dxa" w:w="100"/>
+              <w:bottom w:type="dxa" w:w="80"/>
+              <w:right w:type="dxa" w:w="100"/>
+            </w:tcMar>
+            <w:vAlign w:val="center"/>
+          </w:tcPr>
+          <w:p>
+            <w:pPr>
+              <w:jc w:val="center"/>
+            </w:pPr>
+            <w:r>
+              <w:rPr>
+                <w:b/>
+                <w:bCs/>
+                <w:sz w:val="20"/>
+                <w:szCs w:val="20"/>
+              </w:rPr>
+              <w:t xml:space="preserve">Parameter</w:t>
+            </w:r>
+          </w:p>
+        </w:tc>
+        <w:tc>
+          <w:tcPr>
+            <w:tcW w:type="dxa" w:w="4800"/>
+            <w:shd w:fill="DDDDDD" w:val="clear"/>
+            <w:tcMar>
+              <w:top w:type="dxa" w:w="80"/>
+              <w:left w:type="dxa" w:w="100"/>
+              <w:bottom w:type="dxa" w:w="80"/>
+              <w:right w:type="dxa" w:w="100"/>
+            </w:tcMar>
+            <w:vAlign w:val="center"/>
+          </w:tcPr>
+          <w:p>
+            <w:pPr>
+              <w:jc w:val="center"/>
+            </w:pPr>
+            <w:r>
+              <w:rPr>
+                <w:b/>
+                <w:bCs/>
+                <w:sz w:val="20"/>
+                <w:szCs w:val="20"/>
+              </w:rPr>
+              <w:t xml:space="preserve">Configured Value</w:t>
+            </w:r>
+          </w:p>
+        </w:tc>
+      </w:tr>
+      <w:tr>
+        <w:tc>
+          <w:tcPr>
+            <w:tcW w:type="dxa" w:w="4600"/>
+            <w:tcMar>
+              <w:top w:type="dxa" w:w="80"/>
+              <w:left w:type="dxa" w:w="100"/>
+              <w:bottom w:type="dxa" w:w="80"/>
+              <w:right w:type="dxa" w:w="100"/>
+            </w:tcMar>
+            <w:vAlign w:val="center"/>
+          </w:tcPr>
+          <w:p>
+            <w:pPr>
+              <w:jc w:val="left"/>
+            </w:pPr>
+            <w:r>
+              <w:rPr>
+                <w:b w:val="false"/>
+                <w:bCs w:val="false"/>
+                <w:sz w:val="20"/>
+                <w:szCs w:val="20"/>
+              </w:rPr>
+              <w:t xml:space="preserve">Method</w:t>
+            </w:r>
+          </w:p>
+        </w:tc>
+        <w:tc>
+          <w:tcPr>
+            <w:tcW w:type="dxa" w:w="4800"/>
+            <w:tcMar>
+              <w:top w:type="dxa" w:w="80"/>
+              <w:left w:type="dxa" w:w="100"/>
+              <w:bottom w:type="dxa" w:w="80"/>
+              <w:right w:type="dxa" w:w="100"/>
+            </w:tcMar>
+            <w:vAlign w:val="center"/>
+          </w:tcPr>
+          <w:p>
+            <w:pPr>
+              <w:jc w:val="center"/>
+            </w:pPr>
+            <w:r>
+              <w:rPr>
+                <w:b w:val="false"/>
+                <w:bCs w:val="false"/>
+                <w:sz w:val="20"/>
+                <w:szCs w:val="20"/>
+              </w:rPr>
+              <w:t xml:space="preserve">cv2.createBackgroundSubtractorMOG2(detectShadows=True)</w:t>
+            </w:r>
+          </w:p>
+        </w:tc>
+      </w:tr>
+      <w:tr>
+        <w:tc>
+          <w:tcPr>
+            <w:tcW w:type="dxa" w:w="4600"/>
+            <w:tcMar>
+              <w:top w:type="dxa" w:w="80"/>
+              <w:left w:type="dxa" w:w="100"/>
+              <w:bottom w:type="dxa" w:w="80"/>
+              <w:right w:type="dxa" w:w="100"/>
+            </w:tcMar>
+            <w:vAlign w:val="center"/>
+          </w:tcPr>
+          <w:p>
+            <w:pPr>
+              <w:jc w:val="left"/>
+            </w:pPr>
+            <w:r>
+              <w:rPr>
+                <w:b w:val="false"/>
+                <w:bCs w:val="false"/>
+                <w:sz w:val="20"/>
+                <w:szCs w:val="20"/>
+              </w:rPr>
+              <w:t xml:space="preserve">MOG2 history</w:t>
+            </w:r>
+          </w:p>
+        </w:tc>
+        <w:tc>
+          <w:tcPr>
+            <w:tcW w:type="dxa" w:w="4800"/>
+            <w:tcMar>
+              <w:top w:type="dxa" w:w="80"/>
+              <w:left w:type="dxa" w:w="100"/>
+              <w:bottom w:type="dxa" w:w="80"/>
+              <w:right w:type="dxa" w:w="100"/>
+            </w:tcMar>
+            <w:vAlign w:val="center"/>
+          </w:tcPr>
+          <w:p>
+            <w:pPr>
+              <w:jc w:val="center"/>
+            </w:pPr>
+            <w:r>
+              <w:rPr>
+                <w:b w:val="false"/>
+                <w:bCs w:val="false"/>
+                <w:sz w:val="20"/>
+                <w:szCs w:val="20"/>
+              </w:rPr>
+              <w:t xml:space="preserve">500 frames</w:t>
+            </w:r>
+          </w:p>
+        </w:tc>
+      </w:tr>
+      <w:tr>
+        <w:tc>
+          <w:tcPr>
+            <w:tcW w:type="dxa" w:w="4600"/>
+            <w:tcMar>
+              <w:top w:type="dxa" w:w="80"/>
+              <w:left w:type="dxa" w:w="100"/>
+              <w:bottom w:type="dxa" w:w="80"/>
+              <w:right w:type="dxa" w:w="100"/>
+            </w:tcMar>
+            <w:vAlign w:val="center"/>
+          </w:tcPr>
+          <w:p>
+            <w:pPr>
+              <w:jc w:val="left"/>
+            </w:pPr>
+            <w:r>
+              <w:rPr>
+                <w:b w:val="false"/>
+                <w:bCs w:val="false"/>
+                <w:sz w:val="20"/>
+                <w:szCs w:val="20"/>
+              </w:rPr>
+              <w:t xml:space="preserve">MOG2 variance threshold</w:t>
+            </w:r>
+          </w:p>
+        </w:tc>
+        <w:tc>
+          <w:tcPr>
+            <w:tcW w:type="dxa" w:w="4800"/>
+            <w:tcMar>
+              <w:top w:type="dxa" w:w="80"/>
+              <w:left w:type="dxa" w:w="100"/>
+              <w:bottom w:type="dxa" w:w="80"/>
+              <w:right w:type="dxa" w:w="100"/>
+            </w:tcMar>
+            <w:vAlign w:val="center"/>
+          </w:tcPr>
+          <w:p>
+            <w:pPr>
+              <w:jc w:val="center"/>
+            </w:pPr>
+            <w:r>
+              <w:rPr>
+                <w:b w:val="false"/>
+                <w:bCs w:val="false"/>
+                <w:sz w:val="20"/>
+                <w:szCs w:val="20"/>
+              </w:rPr>
+              <w:t xml:space="preserve">40</w:t>
+            </w:r>
+          </w:p>
+        </w:tc>
+      </w:tr>
+      <w:tr>
+        <w:tc>
+          <w:tcPr>
+            <w:tcW w:type="dxa" w:w="4600"/>
+            <w:tcMar>
+              <w:top w:type="dxa" w:w="80"/>
+              <w:left w:type="dxa" w:w="100"/>
+              <w:bottom w:type="dxa" w:w="80"/>
+              <w:right w:type="dxa" w:w="100"/>
+            </w:tcMar>
+            <w:vAlign w:val="center"/>
+          </w:tcPr>
+          <w:p>
+            <w:pPr>
+              <w:jc w:val="left"/>
+            </w:pPr>
+            <w:r>
+              <w:rPr>
+                <w:b w:val="false"/>
+                <w:bCs w:val="false"/>
+                <w:sz w:val="20"/>
+                <w:szCs w:val="20"/>
+              </w:rPr>
+              <w:t xml:space="preserve">Gaussian blur kernel</w:t>
+            </w:r>
+          </w:p>
+        </w:tc>
+        <w:tc>
+          <w:tcPr>
+            <w:tcW w:type="dxa" w:w="4800"/>
+            <w:tcMar>
+              <w:top w:type="dxa" w:w="80"/>
+              <w:left w:type="dxa" w:w="100"/>
+              <w:bottom w:type="dxa" w:w="80"/>
+              <w:right w:type="dxa" w:w="100"/>
+            </w:tcMar>
+            <w:vAlign w:val="center"/>
+          </w:tcPr>
+          <w:p>
+            <w:pPr>
+              <w:jc w:val="center"/>
+            </w:pPr>
+            <w:r>
+              <w:rPr>
+                <w:b w:val="false"/>
+                <w:bCs w:val="false"/>
+                <w:sz w:val="20"/>
+                <w:szCs w:val="20"/>
+              </w:rPr>
+              <w:t xml:space="preserve">5×5</w:t>
+            </w:r>
+          </w:p>
+        </w:tc>
+      </w:tr>
+      <w:tr>
+        <w:tc>
+          <w:tcPr>
+            <w:tcW w:type="dxa" w:w="4600"/>
+            <w:tcMar>
+              <w:top w:type="dxa" w:w="80"/>
+              <w:left w:type="dxa" w:w="100"/>
+              <w:bottom w:type="dxa" w:w="80"/>
+              <w:right w:type="dxa" w:w="100"/>
+            </w:tcMar>
+            <w:vAlign w:val="center"/>
+          </w:tcPr>
+          <w:p>
+            <w:pPr>
+              <w:jc w:val="left"/>
+            </w:pPr>
+            <w:r>
+              <w:rPr>
+                <w:b w:val="false"/>
+                <w:bCs w:val="false"/>
+                <w:sz w:val="20"/>
+                <w:szCs w:val="20"/>
+              </w:rPr>
+              <w:t xml:space="preserve">Shadow/foreground threshold</w:t>
+            </w:r>
+          </w:p>
+        </w:tc>
+        <w:tc>
+          <w:tcPr>
+            <w:tcW w:type="dxa" w:w="4800"/>
+            <w:tcMar>
+              <w:top w:type="dxa" w:w="80"/>
+              <w:left w:type="dxa" w:w="100"/>
+              <w:bottom w:type="dxa" w:w="80"/>
+              <w:right w:type="dxa" w:w="100"/>
+            </w:tcMar>
+            <w:vAlign w:val="center"/>
+          </w:tcPr>
+          <w:p>
+            <w:pPr>
+              <w:jc w:val="center"/>
+            </w:pPr>
+            <w:r>
+              <w:rPr>
+                <w:b w:val="false"/>
+                <w:bCs w:val="false"/>
+                <w:sz w:val="20"/>
+                <w:szCs w:val="20"/>
+              </w:rPr>
+              <w:t xml:space="preserve">200 (of 255)</w:t>
+            </w:r>
+          </w:p>
+        </w:tc>
+      </w:tr>
+      <w:tr>
+        <w:tc>
+          <w:tcPr>
+            <w:tcW w:type="dxa" w:w="4600"/>
+            <w:tcMar>
+              <w:top w:type="dxa" w:w="80"/>
+              <w:left w:type="dxa" w:w="100"/>
+              <w:bottom w:type="dxa" w:w="80"/>
+              <w:right w:type="dxa" w:w="100"/>
+            </w:tcMar>
+            <w:vAlign w:val="center"/>
+          </w:tcPr>
+          <w:p>
+            <w:pPr>
+              <w:jc w:val="left"/>
+            </w:pPr>
+            <w:r>
+              <w:rPr>
+                <w:b w:val="false"/>
+                <w:bCs w:val="false"/>
+                <w:sz w:val="20"/>
+                <w:szCs w:val="20"/>
+              </w:rPr>
+              <w:t xml:space="preserve">Minimum motion area to trigger</w:t>
+            </w:r>
+          </w:p>
+        </w:tc>
+        <w:tc>
+          <w:tcPr>
+            <w:tcW w:type="dxa" w:w="4800"/>
+            <w:tcMar>
+              <w:top w:type="dxa" w:w="80"/>
+              <w:left w:type="dxa" w:w="100"/>
+              <w:bottom w:type="dxa" w:w="80"/>
+              <w:right w:type="dxa" w:w="100"/>
+            </w:tcMar>
+            <w:vAlign w:val="center"/>
+          </w:tcPr>
+          <w:p>
+            <w:pPr>
+              <w:jc w:val="center"/>
+            </w:pPr>
+            <w:r>
+              <w:rPr>
+                <w:b w:val="false"/>
+                <w:bCs w:val="false"/>
+                <w:sz w:val="20"/>
+                <w:szCs w:val="20"/>
+              </w:rPr>
+              <w:t xml:space="preserve">1,500 px²</w:t>
+            </w:r>
+          </w:p>
+        </w:tc>
+      </w:tr>
+    </w:tbl>
     <w:p>
       <w:pPr>
         <w:pStyle w:val="Heading3"/>
@@ -2204,7 +3192,366 @@
           <w:sz w:val="22"/>
           <w:szCs w:val="22"/>
         </w:rPr>
-        <w:t xml:space="preserve">Contrast-Limited Adaptive Histogram Equalization (CLAHE) is applied to enhance local image contrast under low-light conditions before motion detection and person verification are attempted, improving visibility of otherwise poorly-lit regions of a frame. This enhancement is the system's Night Vision setting. While CLAHE improves detectability in dim conditions, it cannot fully compensate when insufficient visual information is captured by the camera sensor itself, which is the documented source of CAPHY's five low-light false negatives (TC008).</w:t>
+        <w:t xml:space="preserve">Contrast-Limited Adaptive Histogram Equalization (CLAHE) is applied to the lightness channel of the frame (in LAB color space) to enhance local contrast under low-light conditions, followed by a gamma brightness lift, before motion detection and person verification are attempted. Implemented in detection/night_vision.py, this enhancement runs automatically only when the frame's average brightness falls below a configured threshold — it does not needlessly process already well-lit frames — and corresponds to the system's Night Vision setting.</w:t>
+      </w:r>
+    </w:p>
+    <w:tbl>
+      <w:tblPr>
+        <w:tblW w:type="dxa" w:w="9400"/>
+        <w:tblBorders>
+          <w:top w:val="single" w:color="auto" w:sz="4"/>
+          <w:left w:val="single" w:color="auto" w:sz="4"/>
+          <w:bottom w:val="single" w:color="auto" w:sz="4"/>
+          <w:right w:val="single" w:color="auto" w:sz="4"/>
+          <w:insideH w:val="single" w:color="auto" w:sz="4"/>
+          <w:insideV w:val="single" w:color="auto" w:sz="4"/>
+        </w:tblBorders>
+      </w:tblPr>
+      <w:tblGrid>
+        <w:gridCol w:w="4600"/>
+        <w:gridCol w:w="4800"/>
+      </w:tblGrid>
+      <w:tr>
+        <w:trPr>
+          <w:tblHeader/>
+        </w:trPr>
+        <w:tc>
+          <w:tcPr>
+            <w:tcW w:type="dxa" w:w="4600"/>
+            <w:shd w:fill="DDDDDD" w:val="clear"/>
+            <w:tcMar>
+              <w:top w:type="dxa" w:w="80"/>
+              <w:left w:type="dxa" w:w="100"/>
+              <w:bottom w:type="dxa" w:w="80"/>
+              <w:right w:type="dxa" w:w="100"/>
+            </w:tcMar>
+            <w:vAlign w:val="center"/>
+          </w:tcPr>
+          <w:p>
+            <w:pPr>
+              <w:jc w:val="center"/>
+            </w:pPr>
+            <w:r>
+              <w:rPr>
+                <w:b/>
+                <w:bCs/>
+                <w:sz w:val="20"/>
+                <w:szCs w:val="20"/>
+              </w:rPr>
+              <w:t xml:space="preserve">Parameter</w:t>
+            </w:r>
+          </w:p>
+        </w:tc>
+        <w:tc>
+          <w:tcPr>
+            <w:tcW w:type="dxa" w:w="4800"/>
+            <w:shd w:fill="DDDDDD" w:val="clear"/>
+            <w:tcMar>
+              <w:top w:type="dxa" w:w="80"/>
+              <w:left w:type="dxa" w:w="100"/>
+              <w:bottom w:type="dxa" w:w="80"/>
+              <w:right w:type="dxa" w:w="100"/>
+            </w:tcMar>
+            <w:vAlign w:val="center"/>
+          </w:tcPr>
+          <w:p>
+            <w:pPr>
+              <w:jc w:val="center"/>
+            </w:pPr>
+            <w:r>
+              <w:rPr>
+                <w:b/>
+                <w:bCs/>
+                <w:sz w:val="20"/>
+                <w:szCs w:val="20"/>
+              </w:rPr>
+              <w:t xml:space="preserve">Configured Value</w:t>
+            </w:r>
+          </w:p>
+        </w:tc>
+      </w:tr>
+      <w:tr>
+        <w:tc>
+          <w:tcPr>
+            <w:tcW w:type="dxa" w:w="4600"/>
+            <w:tcMar>
+              <w:top w:type="dxa" w:w="80"/>
+              <w:left w:type="dxa" w:w="100"/>
+              <w:bottom w:type="dxa" w:w="80"/>
+              <w:right w:type="dxa" w:w="100"/>
+            </w:tcMar>
+            <w:vAlign w:val="center"/>
+          </w:tcPr>
+          <w:p>
+            <w:pPr>
+              <w:jc w:val="left"/>
+            </w:pPr>
+            <w:r>
+              <w:rPr>
+                <w:b w:val="false"/>
+                <w:bCs w:val="false"/>
+                <w:sz w:val="20"/>
+                <w:szCs w:val="20"/>
+              </w:rPr>
+              <w:t xml:space="preserve">CLAHE clip limit</w:t>
+            </w:r>
+          </w:p>
+        </w:tc>
+        <w:tc>
+          <w:tcPr>
+            <w:tcW w:type="dxa" w:w="4800"/>
+            <w:tcMar>
+              <w:top w:type="dxa" w:w="80"/>
+              <w:left w:type="dxa" w:w="100"/>
+              <w:bottom w:type="dxa" w:w="80"/>
+              <w:right w:type="dxa" w:w="100"/>
+            </w:tcMar>
+            <w:vAlign w:val="center"/>
+          </w:tcPr>
+          <w:p>
+            <w:pPr>
+              <w:jc w:val="center"/>
+            </w:pPr>
+            <w:r>
+              <w:rPr>
+                <w:b w:val="false"/>
+                <w:bCs w:val="false"/>
+                <w:sz w:val="20"/>
+                <w:szCs w:val="20"/>
+              </w:rPr>
+              <w:t xml:space="preserve">2.5</w:t>
+            </w:r>
+          </w:p>
+        </w:tc>
+      </w:tr>
+      <w:tr>
+        <w:tc>
+          <w:tcPr>
+            <w:tcW w:type="dxa" w:w="4600"/>
+            <w:tcMar>
+              <w:top w:type="dxa" w:w="80"/>
+              <w:left w:type="dxa" w:w="100"/>
+              <w:bottom w:type="dxa" w:w="80"/>
+              <w:right w:type="dxa" w:w="100"/>
+            </w:tcMar>
+            <w:vAlign w:val="center"/>
+          </w:tcPr>
+          <w:p>
+            <w:pPr>
+              <w:jc w:val="left"/>
+            </w:pPr>
+            <w:r>
+              <w:rPr>
+                <w:b w:val="false"/>
+                <w:bCs w:val="false"/>
+                <w:sz w:val="20"/>
+                <w:szCs w:val="20"/>
+              </w:rPr>
+              <w:t xml:space="preserve">CLAHE tile grid size</w:t>
+            </w:r>
+          </w:p>
+        </w:tc>
+        <w:tc>
+          <w:tcPr>
+            <w:tcW w:type="dxa" w:w="4800"/>
+            <w:tcMar>
+              <w:top w:type="dxa" w:w="80"/>
+              <w:left w:type="dxa" w:w="100"/>
+              <w:bottom w:type="dxa" w:w="80"/>
+              <w:right w:type="dxa" w:w="100"/>
+            </w:tcMar>
+            <w:vAlign w:val="center"/>
+          </w:tcPr>
+          <w:p>
+            <w:pPr>
+              <w:jc w:val="center"/>
+            </w:pPr>
+            <w:r>
+              <w:rPr>
+                <w:b w:val="false"/>
+                <w:bCs w:val="false"/>
+                <w:sz w:val="20"/>
+                <w:szCs w:val="20"/>
+              </w:rPr>
+              <w:t xml:space="preserve">8 × 8</w:t>
+            </w:r>
+          </w:p>
+        </w:tc>
+      </w:tr>
+      <w:tr>
+        <w:tc>
+          <w:tcPr>
+            <w:tcW w:type="dxa" w:w="4600"/>
+            <w:tcMar>
+              <w:top w:type="dxa" w:w="80"/>
+              <w:left w:type="dxa" w:w="100"/>
+              <w:bottom w:type="dxa" w:w="80"/>
+              <w:right w:type="dxa" w:w="100"/>
+            </w:tcMar>
+            <w:vAlign w:val="center"/>
+          </w:tcPr>
+          <w:p>
+            <w:pPr>
+              <w:jc w:val="left"/>
+            </w:pPr>
+            <w:r>
+              <w:rPr>
+                <w:b w:val="false"/>
+                <w:bCs w:val="false"/>
+                <w:sz w:val="20"/>
+                <w:szCs w:val="20"/>
+              </w:rPr>
+              <w:t xml:space="preserve">Low-light trigger threshold</w:t>
+            </w:r>
+          </w:p>
+        </w:tc>
+        <w:tc>
+          <w:tcPr>
+            <w:tcW w:type="dxa" w:w="4800"/>
+            <w:tcMar>
+              <w:top w:type="dxa" w:w="80"/>
+              <w:left w:type="dxa" w:w="100"/>
+              <w:bottom w:type="dxa" w:w="80"/>
+              <w:right w:type="dxa" w:w="100"/>
+            </w:tcMar>
+            <w:vAlign w:val="center"/>
+          </w:tcPr>
+          <w:p>
+            <w:pPr>
+              <w:jc w:val="center"/>
+            </w:pPr>
+            <w:r>
+              <w:rPr>
+                <w:b w:val="false"/>
+                <w:bCs w:val="false"/>
+                <w:sz w:val="20"/>
+                <w:szCs w:val="20"/>
+              </w:rPr>
+              <w:t xml:space="preserve">Average brightness &lt; 70 (0–255 scale)</w:t>
+            </w:r>
+          </w:p>
+        </w:tc>
+      </w:tr>
+      <w:tr>
+        <w:tc>
+          <w:tcPr>
+            <w:tcW w:type="dxa" w:w="4600"/>
+            <w:tcMar>
+              <w:top w:type="dxa" w:w="80"/>
+              <w:left w:type="dxa" w:w="100"/>
+              <w:bottom w:type="dxa" w:w="80"/>
+              <w:right w:type="dxa" w:w="100"/>
+            </w:tcMar>
+            <w:vAlign w:val="center"/>
+          </w:tcPr>
+          <w:p>
+            <w:pPr>
+              <w:jc w:val="left"/>
+            </w:pPr>
+            <w:r>
+              <w:rPr>
+                <w:b w:val="false"/>
+                <w:bCs w:val="false"/>
+                <w:sz w:val="20"/>
+                <w:szCs w:val="20"/>
+              </w:rPr>
+              <w:t xml:space="preserve">Gamma brightness lift</w:t>
+            </w:r>
+          </w:p>
+        </w:tc>
+        <w:tc>
+          <w:tcPr>
+            <w:tcW w:type="dxa" w:w="4800"/>
+            <w:tcMar>
+              <w:top w:type="dxa" w:w="80"/>
+              <w:left w:type="dxa" w:w="100"/>
+              <w:bottom w:type="dxa" w:w="80"/>
+              <w:right w:type="dxa" w:w="100"/>
+            </w:tcMar>
+            <w:vAlign w:val="center"/>
+          </w:tcPr>
+          <w:p>
+            <w:pPr>
+              <w:jc w:val="center"/>
+            </w:pPr>
+            <w:r>
+              <w:rPr>
+                <w:b w:val="false"/>
+                <w:bCs w:val="false"/>
+                <w:sz w:val="20"/>
+                <w:szCs w:val="20"/>
+              </w:rPr>
+              <w:t xml:space="preserve">1.4</w:t>
+            </w:r>
+          </w:p>
+        </w:tc>
+      </w:tr>
+      <w:tr>
+        <w:tc>
+          <w:tcPr>
+            <w:tcW w:type="dxa" w:w="4600"/>
+            <w:tcMar>
+              <w:top w:type="dxa" w:w="80"/>
+              <w:left w:type="dxa" w:w="100"/>
+              <w:bottom w:type="dxa" w:w="80"/>
+              <w:right w:type="dxa" w:w="100"/>
+            </w:tcMar>
+            <w:vAlign w:val="center"/>
+          </w:tcPr>
+          <w:p>
+            <w:pPr>
+              <w:jc w:val="left"/>
+            </w:pPr>
+            <w:r>
+              <w:rPr>
+                <w:b w:val="false"/>
+                <w:bCs w:val="false"/>
+                <w:sz w:val="20"/>
+                <w:szCs w:val="20"/>
+              </w:rPr>
+              <w:t xml:space="preserve">Auto mode</w:t>
+            </w:r>
+          </w:p>
+        </w:tc>
+        <w:tc>
+          <w:tcPr>
+            <w:tcW w:type="dxa" w:w="4800"/>
+            <w:tcMar>
+              <w:top w:type="dxa" w:w="80"/>
+              <w:left w:type="dxa" w:w="100"/>
+              <w:bottom w:type="dxa" w:w="80"/>
+              <w:right w:type="dxa" w:w="100"/>
+            </w:tcMar>
+            <w:vAlign w:val="center"/>
+          </w:tcPr>
+          <w:p>
+            <w:pPr>
+              <w:jc w:val="center"/>
+            </w:pPr>
+            <w:r>
+              <w:rPr>
+                <w:b w:val="false"/>
+                <w:bCs w:val="false"/>
+                <w:sz w:val="20"/>
+                <w:szCs w:val="20"/>
+              </w:rPr>
+              <w:t xml:space="preserve">Enabled — enhancement applied only when frame is detected as low-light</w:t>
+            </w:r>
+          </w:p>
+        </w:tc>
+      </w:tr>
+    </w:tbl>
+    <w:p>
+      <w:pPr>
+        <w:spacing w:after="160" w:line="360"/>
+        <w:jc w:val="both"/>
+      </w:pPr>
+      <w:r>
+        <w:rPr>
+          <w:sz w:val="22"/>
+          <w:szCs w:val="22"/>
+        </w:rPr>
+        <w:t xml:space="preserve">While CLAHE improves detectability in dim conditions, it cannot fully compensate when insufficient visual information is captured by the camera sensor itself, which is the documented source of CAPHY's five low-light false negatives (TC008).</w:t>
       </w:r>
     </w:p>
     <w:p>
@@ -2231,7 +3578,7 @@
           <w:sz w:val="22"/>
           <w:szCs w:val="22"/>
         </w:rPr>
-        <w:t xml:space="preserve">Only frames flagged by Factor 1 as containing motion are passed to the fine-tuned YOLOv8-nano model described in G.1. This second factor exists specifically to eliminate false alarms from non-human motion (stray animals, swaying trees/plants, shadows) — the leading cause of alert fatigue in conventional motion-only security systems.</w:t>
+        <w:t xml:space="preserve">Only frames flagged by Factor 1 as containing motion are passed to the fine-tuned YOLOv8-nano model described in G.1, implemented in detection/person_detector.py. This second factor exists specifically to eliminate false alarms from non-human motion (stray animals, swaying trees/plants, shadows) — the leading cause of alert fatigue in conventional motion-only security systems. Inference automatically runs on the GPU (CUDA) when available, falling back to CPU otherwise.</w:t>
       </w:r>
     </w:p>
     <w:p>
@@ -2262,7 +3609,7 @@
           <w:sz w:val="22"/>
           <w:szCs w:val="22"/>
         </w:rPr>
-        <w:t xml:space="preserve">[FILL IN — state the exact confidence threshold used to accept a YOLOv8-nano detection as a confirmed person, e.g., 0.5 / 0.6 / 0.7, and whether this is configurable in system Settings.]</w:t>
+        <w:t xml:space="preserve">The system accepts a YOLOv8-nano detection as a confirmed person at a confidence threshold of 0.50 (50%) or higher, using an inference image size of 640×640 and filtering for class ID 0 (person) only.</w:t>
       </w:r>
     </w:p>
     <w:p>
@@ -2280,7 +3627,7 @@
           <w:sz w:val="22"/>
           <w:szCs w:val="22"/>
         </w:rPr>
-        <w:t xml:space="preserve">Person Detection Process</w:t>
+        <w:t xml:space="preserve">Frame-Skip Optimization</w:t>
       </w:r>
     </w:p>
     <w:p>
@@ -2293,7 +3640,38 @@
           <w:sz w:val="22"/>
           <w:szCs w:val="22"/>
         </w:rPr>
-        <w:t xml:space="preserve">Each motion-flagged frame is passed through the fine-tuned YOLOv8-nano model. If the model returns a person-class detection at or above the configured confidence threshold, the detection is confirmed as human and the frame's bounding box is passed forward for distance estimation and threat-tier classification (Section G.3). If no person-class detection meets the threshold, the event is discarded as non-human motion and no alert is generated — this is the mechanism responsible for CAPHY's 100.0% precision and zero recorded false positives across 45 functional trials.</w:t>
+        <w:t xml:space="preserve">To reduce CPU/GPU load, YOLO inference does not run on every single motion-flagged frame; it runs every 8th frame (PERSON_EVERY_N = 8) while a person is present, reusing the most recent bounding boxes on the frames in between. This roughly preserves detection coverage while substantially reducing the computational cost of continuous inference.</w:t>
+      </w:r>
+    </w:p>
+    <w:p>
+      <w:pPr>
+        <w:pStyle w:val="Heading3"/>
+        <w:spacing w:after="100" w:before="180"/>
+      </w:pPr>
+      <w:r>
+        <w:rPr>
+          <w:b/>
+          <w:bCs/>
+          <w:i/>
+          <w:iCs/>
+          <w:color w:val="27221F"/>
+          <w:sz w:val="22"/>
+          <w:szCs w:val="22"/>
+        </w:rPr>
+        <w:t xml:space="preserve">Person Detection Process</w:t>
+      </w:r>
+    </w:p>
+    <w:p>
+      <w:pPr>
+        <w:spacing w:after="160" w:line="360"/>
+        <w:jc w:val="both"/>
+      </w:pPr>
+      <w:r>
+        <w:rPr>
+          <w:sz w:val="22"/>
+          <w:szCs w:val="22"/>
+        </w:rPr>
+        <w:t xml:space="preserve">Each sampled motion-flagged frame is passed through the fine-tuned YOLOv8-nano model. If the model returns a person-class detection at or above the 0.50 confidence threshold, the detection is confirmed as human and the frame's bounding box is passed forward for distance estimation and threat-tier classification (Section G.3). If no person-class detection meets the threshold, the event is discarded as non-human motion and no alert is generated — this two-factor gating (implemented in detection/two_factor.py) is the mechanism responsible for CAPHY's 100.0% precision and zero recorded false positives across 45 functional trials.</w:t>
       </w:r>
     </w:p>
     <w:p>
@@ -2312,6 +3690,19 @@
     </w:p>
     <w:p>
       <w:pPr>
+        <w:spacing w:after="160" w:line="360"/>
+        <w:jc w:val="both"/>
+      </w:pPr>
+      <w:r>
+        <w:rPr>
+          <w:sz w:val="22"/>
+          <w:szCs w:val="22"/>
+        </w:rPr>
+        <w:t xml:space="preserve">Implemented in detection/tier_engine.py.</w:t>
+      </w:r>
+    </w:p>
+    <w:p>
+      <w:pPr>
         <w:pStyle w:val="Heading2"/>
         <w:spacing w:after="120" w:before="240"/>
       </w:pPr>
@@ -2334,7 +3725,210 @@
           <w:sz w:val="22"/>
           <w:szCs w:val="22"/>
         </w:rPr>
-        <w:t xml:space="preserve">Once a person is confirmed by Factor 2, CAPHY estimates the subject's distance from the camera using the height of the returned bounding box: closer subjects produce taller bounding boxes, and farther subjects produce shorter ones. [FILL IN — if you use a specific calibrated formula (e.g., a reference height/focal-length calculation) rather than a general proportional estimate, state the exact formula and any calibration constants used.]</w:t>
+        <w:t xml:space="preserve">Once a person is confirmed by Factor 2, CAPHY estimates the subject's distance from the camera using an inverse relationship with the height of the returned bounding box: closer subjects produce taller bounding boxes (and a smaller estimated distance), while farther subjects produce shorter bounding boxes (and a larger estimated distance).</w:t>
+      </w:r>
+    </w:p>
+    <w:tbl>
+      <w:tblPr>
+        <w:tblW w:type="dxa" w:w="9400"/>
+        <w:tblBorders>
+          <w:top w:val="single" w:color="auto" w:sz="4"/>
+          <w:left w:val="single" w:color="auto" w:sz="4"/>
+          <w:bottom w:val="single" w:color="auto" w:sz="4"/>
+          <w:right w:val="single" w:color="auto" w:sz="4"/>
+          <w:insideH w:val="single" w:color="auto" w:sz="4"/>
+          <w:insideV w:val="single" w:color="auto" w:sz="4"/>
+        </w:tblBorders>
+      </w:tblPr>
+      <w:tblGrid>
+        <w:gridCol w:w="4600"/>
+        <w:gridCol w:w="4800"/>
+      </w:tblGrid>
+      <w:tr>
+        <w:trPr>
+          <w:tblHeader/>
+        </w:trPr>
+        <w:tc>
+          <w:tcPr>
+            <w:tcW w:type="dxa" w:w="4600"/>
+            <w:shd w:fill="DDDDDD" w:val="clear"/>
+            <w:tcMar>
+              <w:top w:type="dxa" w:w="80"/>
+              <w:left w:type="dxa" w:w="100"/>
+              <w:bottom w:type="dxa" w:w="80"/>
+              <w:right w:type="dxa" w:w="100"/>
+            </w:tcMar>
+            <w:vAlign w:val="center"/>
+          </w:tcPr>
+          <w:p>
+            <w:pPr>
+              <w:jc w:val="center"/>
+            </w:pPr>
+            <w:r>
+              <w:rPr>
+                <w:b/>
+                <w:bCs/>
+                <w:sz w:val="20"/>
+                <w:szCs w:val="20"/>
+              </w:rPr>
+              <w:t xml:space="preserve">Item</w:t>
+            </w:r>
+          </w:p>
+        </w:tc>
+        <w:tc>
+          <w:tcPr>
+            <w:tcW w:type="dxa" w:w="4800"/>
+            <w:shd w:fill="DDDDDD" w:val="clear"/>
+            <w:tcMar>
+              <w:top w:type="dxa" w:w="80"/>
+              <w:left w:type="dxa" w:w="100"/>
+              <w:bottom w:type="dxa" w:w="80"/>
+              <w:right w:type="dxa" w:w="100"/>
+            </w:tcMar>
+            <w:vAlign w:val="center"/>
+          </w:tcPr>
+          <w:p>
+            <w:pPr>
+              <w:jc w:val="center"/>
+            </w:pPr>
+            <w:r>
+              <w:rPr>
+                <w:b/>
+                <w:bCs/>
+                <w:sz w:val="20"/>
+                <w:szCs w:val="20"/>
+              </w:rPr>
+              <w:t xml:space="preserve">Value</w:t>
+            </w:r>
+          </w:p>
+        </w:tc>
+      </w:tr>
+      <w:tr>
+        <w:tc>
+          <w:tcPr>
+            <w:tcW w:type="dxa" w:w="4600"/>
+            <w:tcMar>
+              <w:top w:type="dxa" w:w="80"/>
+              <w:left w:type="dxa" w:w="100"/>
+              <w:bottom w:type="dxa" w:w="80"/>
+              <w:right w:type="dxa" w:w="100"/>
+            </w:tcMar>
+            <w:vAlign w:val="center"/>
+          </w:tcPr>
+          <w:p>
+            <w:pPr>
+              <w:jc w:val="left"/>
+            </w:pPr>
+            <w:r>
+              <w:rPr>
+                <w:b w:val="false"/>
+                <w:bCs w:val="false"/>
+                <w:sz w:val="20"/>
+                <w:szCs w:val="20"/>
+              </w:rPr>
+              <w:t xml:space="preserve">Formula</w:t>
+            </w:r>
+          </w:p>
+        </w:tc>
+        <w:tc>
+          <w:tcPr>
+            <w:tcW w:type="dxa" w:w="4800"/>
+            <w:tcMar>
+              <w:top w:type="dxa" w:w="80"/>
+              <w:left w:type="dxa" w:w="100"/>
+              <w:bottom w:type="dxa" w:w="80"/>
+              <w:right w:type="dxa" w:w="100"/>
+            </w:tcMar>
+            <w:vAlign w:val="center"/>
+          </w:tcPr>
+          <w:p>
+            <w:pPr>
+              <w:jc w:val="center"/>
+            </w:pPr>
+            <w:r>
+              <w:rPr>
+                <w:b w:val="false"/>
+                <w:bCs w:val="false"/>
+                <w:sz w:val="20"/>
+                <w:szCs w:val="20"/>
+              </w:rPr>
+              <w:t xml:space="preserve">distance (m) = DISTANCE_K ÷ bounding_box_height_px</w:t>
+            </w:r>
+          </w:p>
+        </w:tc>
+      </w:tr>
+      <w:tr>
+        <w:tc>
+          <w:tcPr>
+            <w:tcW w:type="dxa" w:w="4600"/>
+            <w:tcMar>
+              <w:top w:type="dxa" w:w="80"/>
+              <w:left w:type="dxa" w:w="100"/>
+              <w:bottom w:type="dxa" w:w="80"/>
+              <w:right w:type="dxa" w:w="100"/>
+            </w:tcMar>
+            <w:vAlign w:val="center"/>
+          </w:tcPr>
+          <w:p>
+            <w:pPr>
+              <w:jc w:val="left"/>
+            </w:pPr>
+            <w:r>
+              <w:rPr>
+                <w:b w:val="false"/>
+                <w:bCs w:val="false"/>
+                <w:sz w:val="20"/>
+                <w:szCs w:val="20"/>
+              </w:rPr>
+              <w:t xml:space="preserve">DISTANCE_K constant</w:t>
+            </w:r>
+          </w:p>
+        </w:tc>
+        <w:tc>
+          <w:tcPr>
+            <w:tcW w:type="dxa" w:w="4800"/>
+            <w:tcMar>
+              <w:top w:type="dxa" w:w="80"/>
+              <w:left w:type="dxa" w:w="100"/>
+              <w:bottom w:type="dxa" w:w="80"/>
+              <w:right w:type="dxa" w:w="100"/>
+            </w:tcMar>
+            <w:vAlign w:val="center"/>
+          </w:tcPr>
+          <w:p>
+            <w:pPr>
+              <w:jc w:val="center"/>
+            </w:pPr>
+            <w:r>
+              <w:rPr>
+                <w:b w:val="false"/>
+                <w:bCs w:val="false"/>
+                <w:sz w:val="20"/>
+                <w:szCs w:val="20"/>
+              </w:rPr>
+              <w:t xml:space="preserve">1350.0 (calibrated for a 1080p camera frame height)</w:t>
+            </w:r>
+          </w:p>
+        </w:tc>
+      </w:tr>
+    </w:tbl>
+    <w:p>
+      <w:pPr>
+        <w:pBdr>
+          <w:left w:val="single" w:color="5A5A5A" w:sz="12" w:space="8"/>
+        </w:pBdr>
+        <w:spacing w:after="200" w:before="80"/>
+        <w:ind w:left="240"/>
+      </w:pPr>
+      <w:r>
+        <w:rPr>
+          <w:i/>
+          <w:iCs/>
+          <w:color w:val="5A5A5A"/>
+          <w:sz w:val="20"/>
+          <w:szCs w:val="20"/>
+        </w:rPr>
+        <w:t xml:space="preserve">DISTANCE_K was empirically calibrated against the project's 1920×1080 camera setup — if camera resolution changes, this constant must be recalibrated, per the comment in config.py.</w:t>
       </w:r>
     </w:p>
     <w:p>
@@ -2449,7 +4043,7 @@
                 <w:sz w:val="20"/>
                 <w:szCs w:val="20"/>
               </w:rPr>
-              <w:t xml:space="preserve">Response</w:t>
+              <w:t xml:space="preserve">Response (Unarmed)</w:t>
             </w:r>
           </w:p>
         </w:tc>
@@ -2529,7 +4123,7 @@
                 <w:sz w:val="20"/>
                 <w:szCs w:val="20"/>
               </w:rPr>
-              <w:t xml:space="preserve">Snapshot captured and notification sent</w:t>
+              <w:t xml:space="preserve">Snapshot + notification</w:t>
             </w:r>
           </w:p>
         </w:tc>
@@ -2609,7 +4203,7 @@
                 <w:sz w:val="20"/>
                 <w:szCs w:val="20"/>
               </w:rPr>
-              <w:t xml:space="preserve">Adds a short video clip to the Tier 1 response</w:t>
+              <w:t xml:space="preserve">Snapshot + notification + 5-second video clip</w:t>
             </w:r>
           </w:p>
         </w:tc>
@@ -2689,7 +4283,7 @@
                 <w:sz w:val="20"/>
                 <w:szCs w:val="20"/>
               </w:rPr>
-              <w:t xml:space="preserve">Adds siren activation to the Tier 2 response</w:t>
+              <w:t xml:space="preserve">Snapshot + continuous video until subject exits + siren + notification (requires acknowledgment)</w:t>
             </w:r>
           </w:p>
         </w:tc>
@@ -2719,7 +4313,7 @@
           <w:sz w:val="22"/>
           <w:szCs w:val="22"/>
         </w:rPr>
-        <w:t xml:space="preserve">Raw per-frame distance estimates can fluctuate slightly from frame to frame even for a stationary subject, due to minor bounding-box jitter. CAPHY applies smoothing across a short window of recent frames before committing to a distance value, preventing a single noisy frame from triggering an incorrect tier.</w:t>
+        <w:t xml:space="preserve">Raw per-frame distance estimates can fluctuate slightly from frame to frame even for a stationary subject, due to minor bounding-box jitter. CAPHY applies exponential moving-average smoothing (smoothing factor = 0.35, meaning each new reading contributes 35% of the updated estimate) before committing to a distance value, preventing a single noisy frame from triggering an incorrect tier.</w:t>
       </w:r>
     </w:p>
     <w:p>
@@ -2746,7 +4340,7 @@
           <w:sz w:val="22"/>
           <w:szCs w:val="22"/>
         </w:rPr>
-        <w:t xml:space="preserve">To prevent rapid tier flapping when a subject is positioned near a tier boundary (for example, hovering around the 4.5m Tier 1/Tier 2 threshold), CAPHY applies hysteresis: a subject must cross a tier boundary by a margin, or sustain the new distance across multiple smoothed readings, before the system commits to escalating or de-escalating the threat tier. This keeps alert behavior stable rather than triggering repeated tier changes for small movements at a boundary.</w:t>
+        <w:t xml:space="preserve">Testing without hysteresis measured 13 tier changes across 20 frames for a motionless person standing near the 4.5 m boundary, including spurious jumps to Tier 3 that would fire the siren at random. To prevent this rapid tier flapping, CAPHY applies a hysteresis margin of 0.12 (12%): a subject must cross a tier boundary by that margin before the system commits to escalating or de-escalating the threat tier, so a reading sitting exactly on the line stays at its current tier. The tier resets to neutral whenever motion clears (the person exits frame), so the next detected person starts classification from scratch.</w:t>
       </w:r>
     </w:p>
     <w:p>
@@ -2773,7 +4367,7 @@
           <w:sz w:val="22"/>
           <w:szCs w:val="22"/>
         </w:rPr>
-        <w:t xml:space="preserve">In Armed Mode, all confirmed human detections — regardless of estimated distance — are escalated directly to the full Tier 3 response (snapshot, video clip, and siren), reflecting that any human presence while the system is armed represents a full-priority event. In Disarmed/normal monitoring mode, the standard distance-based Tier 1–3 classification in G.3.2 applies.</w:t>
+        <w:t xml:space="preserve">In Armed Mode, all confirmed human detections — regardless of estimated distance — are escalated directly to the full Tier 3-equivalent response (snapshot + continuous recording + siren + a high-priority "ARMED" notification requiring acknowledgment), reflecting that any human presence while the system is armed represents a full-priority event. In Disarmed/normal monitoring mode, the standard distance-based Tier 1–3 classification and response table in G.3.2 applies.</w:t>
       </w:r>
     </w:p>
     <w:p>
@@ -3548,6 +5142,82 @@
     </w:p>
     <w:p>
       <w:pPr>
+        <w:spacing w:after="60" w:before="200"/>
+        <w:jc w:val="center"/>
+      </w:pPr>
+      <w:r>
+        <w:rPr>
+          <w:b/>
+          <w:bCs/>
+          <w:sz w:val="21"/>
+          <w:szCs w:val="21"/>
+        </w:rPr>
+        <w:t xml:space="preserve">Figure G.3. Model Predictions on Validation Images</w:t>
+      </w:r>
+    </w:p>
+    <w:p>
+      <w:pPr>
+        <w:spacing w:after="60"/>
+        <w:jc w:val="center"/>
+      </w:pPr>
+      <w:r>
+        <w:drawing>
+          <wp:inline distT="0" distB="0" distL="0" distR="0">
+            <wp:extent cx="5905500" cy="4505325"/>
+            <wp:effectExtent t="0" r="0" b="0" l="0"/>
+            <wp:docPr id="1" name="" descr="" title=""/>
+            <wp:cNvGraphicFramePr>
+              <a:graphicFrameLocks xmlns:a="http://schemas.openxmlformats.org/drawingml/2006/main" noChangeAspect="1"/>
+            </wp:cNvGraphicFramePr>
+            <a:graphic xmlns:a="http://schemas.openxmlformats.org/drawingml/2006/main">
+              <a:graphicData uri="http://schemas.openxmlformats.org/drawingml/2006/picture">
+                <pic:pic xmlns:pic="http://schemas.openxmlformats.org/drawingml/2006/picture">
+                  <pic:nvPicPr>
+                    <pic:cNvPr id="0" name="" descr=""/>
+                    <pic:cNvPicPr>
+                      <a:picLocks noChangeAspect="1" noChangeArrowheads="1"/>
+                    </pic:cNvPicPr>
+                  </pic:nvPicPr>
+                  <pic:blipFill>
+                    <a:blip r:embed="rId10" cstate="none"/>
+                    <a:srcRect/>
+                    <a:stretch>
+                      <a:fillRect/>
+                    </a:stretch>
+                  </pic:blipFill>
+                  <pic:spPr bwMode="auto">
+                    <a:xfrm>
+                      <a:off x="0" y="0"/>
+                      <a:ext cx="5905500" cy="4505325"/>
+                    </a:xfrm>
+                    <a:prstGeom prst="rect">
+                      <a:avLst/>
+                    </a:prstGeom>
+                  </pic:spPr>
+                </pic:pic>
+              </a:graphicData>
+            </a:graphic>
+          </wp:inline>
+        </w:drawing>
+      </w:r>
+    </w:p>
+    <w:p>
+      <w:pPr>
+        <w:spacing w:after="160"/>
+        <w:jc w:val="center"/>
+      </w:pPr>
+      <w:r>
+        <w:rPr>
+          <w:i/>
+          <w:iCs/>
+          <w:sz w:val="19"/>
+          <w:szCs w:val="19"/>
+        </w:rPr>
+        <w:t xml:space="preserve">Actual YOLOv8-nano predictions (bounding boxes and confidence scores) on a held-out validation batch, generated automatically by Ultralytics during training.</w:t>
+      </w:r>
+    </w:p>
+    <w:p>
+      <w:pPr>
         <w:pBdr>
           <w:left w:val="single" w:color="990011" w:sz="12" w:space="8"/>
         </w:pBdr>
@@ -3562,7 +5232,7 @@
           <w:sz w:val="21"/>
           <w:szCs w:val="21"/>
         </w:rPr>
-        <w:t xml:space="preserve">[FILL IN — Insert 2–4 annotated screenshots showing: (1) a correctly confirmed daytime detection with bounding box and tier label, (2) a correctly rejected non-human motion event (e.g., TC009), and (3) a low-light missed-detection example (TC008), to visually support the metrics above.]</w:t>
+        <w:t xml:space="preserve">[FILL IN — Optionally add 2–3 screenshots from your own live system (not the training run) showing: a real-time confirmed detection with tier label in the CAPHY dashboard, a correctly ignored non-human motion event, and a low-light missed-detection example (TC008) — these come from your actual running app, not the GitHub repo, so a screenshot is the only way to capture them.]</w:t>
       </w:r>
     </w:p>
     <w:sectPr>

</xml_diff>